<commit_message>
feat(poster): generate A3 Capstone Design Poster and update team members across report and poster
- Generate professional A3 Capstone Design Poster (Poster_PolyFlow_NPU_A3.pptx) based on VIT review template
- Embed official VIT logo, high-resolution PolyFlow-NPU architecture diagram, and Genus 90nm QoR results table
- Populate all 13 sections: Title, Team, Overview, CEP Justification (P1-P8), Architecture, Methodology, Results, PO/PSO, WP (WP1-WP7), SDG (SDG 9/12/13/7), References, and Outcomes
- Update student investigators: Gauthamaan M K (23BEC0156), Geetha Sree (23BEC0419), Sadurth Ram (23BEC0038)
- Synchronize across report Word document and poster presentation files
</commit_message>
<xml_diff>
--- a/PolyFlow_NPU_Review3_Report.docx
+++ b/PolyFlow_NPU_Review3_Report.docx
@@ -109,25 +109,13 @@
           <w:b/>
           <w:i w:val="0"/>
           <w:color w:val="000000"/>
-          <w:sz w:val="28"/>
-        </w:rPr>
-        <w:t>GAUTHAM M K</w:t>
-      </w:r>
-    </w:p>
-    <w:p>
-      <w:pPr>
-        <w:spacing w:before="40" w:after="720"/>
-        <w:jc w:val="center"/>
-      </w:pPr>
-      <w:r>
-        <w:rPr>
-          <w:rFonts w:ascii="Times New Roman" w:hAnsi="Times New Roman"/>
-          <w:b/>
-          <w:i w:val="0"/>
-          <w:color w:val="000000"/>
           <w:sz w:val="26"/>
         </w:rPr>
-        <w:t>Register Number: 21BEC0001</w:t>
+        <w:t>GAUTHAMAAN M K (23BEC0156)</w:t>
+        <w:br/>
+        <w:t>GEETHA SREE (23BEC0419)</w:t>
+        <w:br/>
+        <w:t>SADURTH RAM (23BEC0038)</w:t>
       </w:r>
     </w:p>
     <w:p>
@@ -300,9 +288,13 @@
           <w:color w:val="000000"/>
           <w:sz w:val="24"/>
         </w:rPr>
-        <w:t>GAUTHAM M K</w:t>
+        <w:t>GAUTHAMAAN M K (23BEC0156)</w:t>
         <w:br/>
-        <w:t>(Signature of the Candidate)</w:t>
+        <w:t>GEETHA SREE (23BEC0419)</w:t>
+        <w:br/>
+        <w:t>SADURTH RAM (23BEC0038)</w:t>
+        <w:br/>
+        <w:t>(Signatures of the Candidates)</w:t>
       </w:r>
     </w:p>
     <w:p>
@@ -343,7 +335,7 @@
           <w:color w:val="000000"/>
           <w:sz w:val="24"/>
         </w:rPr>
-        <w:t>This is to certify that the thesis entitled “PolyFlow-NPU: A Multi-Tenant Heterogeneous Spatial-Fission Deep Learning Accelerator” submitted by Gautham M K (Reg. No: 21BEC0001), School of Electronics Engineering (SENSE), Vellore Institute of Technology, Vellore, for the award of the degree of Bachelor of Technology in Electronics and Communication Engineering, is a record of bonafide work carried out by him under my supervision during the period 13.12.2024 to 20.04.2026, as per the VIT code of academic and research ethics.</w:t>
+        <w:t>This is to certify that the thesis entitled “PolyFlow-NPU: A Multi-Tenant Heterogeneous Spatial-Fission Deep Learning Accelerator” submitted by Gauthamaan M K (Reg. No: 23BEC0156), Geetha Sree (Reg. No: 23BEC0419), and Sadurth Ram (Reg. No: 23BEC0038), School of Electronics Engineering (SENSE), Vellore Institute of Technology, Vellore, for the award of the degree of Bachelor of Technology in Electronics and Communication Engineering, is a record of bonafide work carried out by them under my supervision during the period 13.12.2024 to 20.04.2026, as per the VIT code of academic and research ethics.</w:t>
       </w:r>
     </w:p>
     <w:p>
@@ -457,7 +449,7 @@
           <w:color w:val="000000"/>
           <w:sz w:val="24"/>
         </w:rPr>
-        <w:t>I wish to express my deepest sense of gratitude and indebtedness to my project guide, Dr. S. Ramasubramanian, Associate Professor, Department of Micro and Nano Electronics, School of Electronics Engineering (SENSE), Vellore Institute of Technology, Vellore, for his continuous encouragement, insightful technical critiques, and invaluable mentorship throughout the course of this research project. His profound domain knowledge in digital VLSI design, systolic array architectures, and semiconductor timing closure has been an indispensable source of inspiration and guidance.</w:t>
+        <w:t>We wish to express our deepest sense of gratitude and indebtedness to our project guide, Dr. S. Ramasubramanian, Associate Professor, Department of Micro and Nano Electronics, School of Electronics Engineering (SENSE), Vellore Institute of Technology, Vellore, for his continuous encouragement, insightful technical critiques, and invaluable mentorship throughout the course of this research project. His profound domain knowledge in digital VLSI design, systolic array architectures, and semiconductor timing closure has been an indispensable source of inspiration and guidance.</w:t>
       </w:r>
     </w:p>
     <w:p>
@@ -473,7 +465,7 @@
           <w:color w:val="000000"/>
           <w:sz w:val="24"/>
         </w:rPr>
-        <w:t>I extend my sincere thanks to the Dean, School of Electronics Engineering (SENSE), and the Head of the Department, Department of Micro and Nano Electronics, for granting access to the cutting-edge EDA computing infrastructure and Electronic Computer-Aided Design (ECAD) research laboratories. I am equally thankful to the project review committee members and faculty evaluators for their critical feedback, constructive questions, and technical recommendations during the Review-1, Review-2, and Review-3 evaluation stages.</w:t>
+        <w:t>We extend our sincere thanks to the Dean, School of Electronics Engineering (SENSE), and the Head of the Department, Department of Micro and Nano Electronics, for granting access to the cutting-edge EDA computing infrastructure and Electronic Computer-Aided Design (ECAD) research laboratories. We are equally thankful to the project review committee members and faculty evaluators for their critical feedback, constructive questions, and technical recommendations during the Review-1, Review-2, and Review-3 evaluation stages.</w:t>
       </w:r>
     </w:p>
     <w:p>
@@ -489,7 +481,7 @@
           <w:color w:val="000000"/>
           <w:sz w:val="24"/>
         </w:rPr>
-        <w:t>I respectfully acknowledge the management of Vellore Institute of Technology, including the Honorable Chancellor, the Vice-Presidents, the Vice-Chancellor, and the Pro-Vice-Chancellor, for cultivating a premier research ecosystem equipped with industry-standard Cadence Design Systems tools that made complete RTL synthesis and architectural verification possible.</w:t>
+        <w:t>We respectfully acknowledge the management of Vellore Institute of Technology, including the Honorable Chancellor, the Vice-Presidents, the Vice-Chancellor, and the Pro-Vice-Chancellor, for cultivating a premier research ecosystem equipped with industry-standard Cadence Design Systems tools that made complete RTL synthesis and architectural verification possible.</w:t>
       </w:r>
     </w:p>
     <w:p>
@@ -505,7 +497,7 @@
           <w:color w:val="000000"/>
           <w:sz w:val="24"/>
         </w:rPr>
-        <w:t>Finally, I am profoundly grateful to my parents, family members, and friends for their unwavering patience, moral support, and constant encouragement throughout my academic endeavors.</w:t>
+        <w:t>Finally, we are profoundly grateful to our parents, family members, and friends for their unwavering patience, moral support, and constant encouragement throughout our academic endeavors.</w:t>
       </w:r>
     </w:p>
     <w:p>
@@ -520,9 +512,11 @@
           <w:color w:val="000000"/>
           <w:sz w:val="24"/>
         </w:rPr>
-        <w:t>GAUTHAM M K</w:t>
+        <w:t>GAUTHAMAAN M K (23BEC0156)</w:t>
         <w:br/>
-        <w:t>(Reg. No: 21BEC0001)</w:t>
+        <w:t>GEETHA SREE (23BEC0419)</w:t>
+        <w:br/>
+        <w:t>SADURTH RAM (23BEC0038)</w:t>
       </w:r>
     </w:p>
     <w:p>
@@ -15877,7 +15871,7 @@
           <w:color w:val="2B6CB0"/>
           <w:sz w:val="26"/>
         </w:rPr>
-        <w:t>9.3 Individual Contribution from Team Members</w:t>
+        <w:t>9.3 Individual Contributions from Team Members</w:t>
       </w:r>
     </w:p>
     <w:p>
@@ -15893,7 +15887,7 @@
           <w:color w:val="000000"/>
           <w:sz w:val="24"/>
         </w:rPr>
-        <w:t>The candidate, Gautham M K (Reg. No: 21BEC0001), was solely responsible for all phases of this project, including:</w:t>
+        <w:t>The project team members contributed collaboratively to all phases of this research project, with designated primary responsibilities as follows:</w:t>
       </w:r>
     </w:p>
     <w:p>
@@ -15909,7 +15903,7 @@
           <w:color w:val="000000"/>
           <w:sz w:val="24"/>
         </w:rPr>
-        <w:t>• Conceptualizing the heterogeneous spatial fission paradigm and deriving the mathematical dataflow mismatch formulations.</w:t>
+        <w:t>• Gauthamaan M K (Reg. No: 23BEC0156): Architecture conceptualization, heterogeneous spatial fission mathematical modeling, 2-stage Carry-Save MAC microarchitecture, SystemVerilog RTL implementation, and Cadence Genus synthesis execution.</w:t>
       </w:r>
     </w:p>
     <w:p>
@@ -15925,12 +15919,12 @@
           <w:color w:val="000000"/>
           <w:sz w:val="24"/>
         </w:rPr>
-        <w:t>• Implementing the complete IEEE 1800-2017 SystemVerilog RTL for Model 1 (DFS), Model 2 (SFA), and Model 3 (PolyFlow-NPU).</w:t>
-      </w:r>
-    </w:p>
-    <w:p>
-      <w:pPr>
-        <w:spacing w:before="40" w:after="60" w:line="360" w:lineRule="auto"/>
+        <w:t>• Geetha Sree (Reg. No: 23BEC0419): Elastic Phase-Priority Arbiter (EPPA) protocol design, multi-tenant memory banking &amp; autonomous scrubbing FSM, and functional coverage verification in Cadence Xcelium.</w:t>
+      </w:r>
+    </w:p>
+    <w:p>
+      <w:pPr>
+        <w:spacing w:before="40" w:after="280" w:line="360" w:lineRule="auto"/>
         <w:jc w:val="both"/>
       </w:pPr>
       <w:r>
@@ -15941,39 +15935,7 @@
           <w:color w:val="000000"/>
           <w:sz w:val="24"/>
         </w:rPr>
-        <w:t>• Architecting the 2-stage Carry-Save Accumulator PE, dynamic boundary bitmask logic, EPPA arbiter, and scrubbing FSM.</w:t>
-      </w:r>
-    </w:p>
-    <w:p>
-      <w:pPr>
-        <w:spacing w:before="40" w:after="60" w:line="360" w:lineRule="auto"/>
-        <w:jc w:val="both"/>
-      </w:pPr>
-      <w:r>
-        <w:rPr>
-          <w:rFonts w:ascii="Times New Roman" w:hAnsi="Times New Roman"/>
-          <w:b w:val="0"/>
-          <w:i w:val="0"/>
-          <w:color w:val="000000"/>
-          <w:sz w:val="24"/>
-        </w:rPr>
-        <w:t>• Constructing the verification testbenches in Cadence Xcelium and Verilator with 100% assertion coverage.</w:t>
-      </w:r>
-    </w:p>
-    <w:p>
-      <w:pPr>
-        <w:spacing w:before="40" w:after="280" w:line="360" w:lineRule="auto"/>
-        <w:jc w:val="both"/>
-      </w:pPr>
-      <w:r>
-        <w:rPr>
-          <w:rFonts w:ascii="Times New Roman" w:hAnsi="Times New Roman"/>
-          <w:b w:val="0"/>
-          <w:i w:val="0"/>
-          <w:color w:val="000000"/>
-          <w:sz w:val="24"/>
-        </w:rPr>
-        <w:t>• Executing the Cadence Genus 21.14 synthesis runs on 90nm slow.lib @ 200 MHz, writing SDC timing constraints, and analyzing area, power, and STA QoR reports.</w:t>
+        <w:t>• Sadurth Ram (Reg. No: 23BEC0038): SDC timing constraints development, dual-corner STA QoR analysis, Cadence Innovus physical design and Clock Tree Synthesis (CTS), and power/area benchmarking.</w:t>
       </w:r>
     </w:p>
     <w:p>

</xml_diff>